<commit_message>
Add EDA notebook and dataset evaluation matrix for 20 Newsgroup, RCv1v2, and LectureBank
</commit_message>
<xml_diff>
--- a/outputs/topics/Dataset Evaluation Matrix.docx
+++ b/outputs/topics/Dataset Evaluation Matrix.docx
@@ -19,7 +19,7 @@
     </w:p>
     <w:tbl>
       <w:tblPr>
-        <w:tblW w:w="0" w:type="auto"/>
+        <w:tblW w:w="10471" w:type="dxa"/>
         <w:tblBorders>
           <w:top w:val="outset" w:sz="6" w:space="0" w:color="auto"/>
           <w:left w:val="outset" w:sz="6" w:space="0" w:color="auto"/>
@@ -33,10 +33,11 @@
         <w:tblLook w:val="04A0" w:firstRow="1" w:lastRow="0" w:firstColumn="1" w:lastColumn="0" w:noHBand="0" w:noVBand="1"/>
       </w:tblPr>
       <w:tblGrid>
-        <w:gridCol w:w="1592"/>
-        <w:gridCol w:w="3390"/>
-        <w:gridCol w:w="2539"/>
-        <w:gridCol w:w="2929"/>
+        <w:gridCol w:w="1582"/>
+        <w:gridCol w:w="3356"/>
+        <w:gridCol w:w="2626"/>
+        <w:gridCol w:w="21"/>
+        <w:gridCol w:w="2886"/>
       </w:tblGrid>
       <w:tr>
         <w:tc>
@@ -132,13 +133,6 @@
               <w:bottom w:val="single" w:sz="6" w:space="0" w:color="909090"/>
               <w:right w:val="single" w:sz="6" w:space="0" w:color="909090"/>
             </w:tcBorders>
-            <w:tcMar>
-              <w:top w:w="45" w:type="dxa"/>
-              <w:left w:w="0" w:type="dxa"/>
-              <w:bottom w:w="45" w:type="dxa"/>
-              <w:right w:w="0" w:type="dxa"/>
-            </w:tcMar>
-            <w:hideMark/>
           </w:tcPr>
           <w:p>
             <w:pPr>
@@ -151,18 +145,36 @@
               <w:rPr>
                 <w:b/>
                 <w:bCs/>
-                <w:i/>
-                <w:iCs/>
-              </w:rPr>
-              <w:t>RCV1-v2</w:t>
-            </w:r>
-            <w:r>
-              <w:rPr>
-                <w:i/>
-                <w:iCs/>
-              </w:rPr>
-              <w:t> </w:t>
-            </w:r>
+                <w:sz w:val="18"/>
+                <w:szCs w:val="18"/>
+              </w:rPr>
+              <w:t>RCV1/RCV2 (UCI)</w:t>
+            </w:r>
+          </w:p>
+        </w:tc>
+        <w:tc>
+          <w:tcPr>
+            <w:tcW w:w="0" w:type="auto"/>
+            <w:tcBorders>
+              <w:top w:val="single" w:sz="6" w:space="0" w:color="909090"/>
+              <w:left w:val="single" w:sz="6" w:space="0" w:color="909090"/>
+              <w:bottom w:val="single" w:sz="6" w:space="0" w:color="909090"/>
+              <w:right w:val="single" w:sz="6" w:space="0" w:color="909090"/>
+            </w:tcBorders>
+            <w:tcMar>
+              <w:top w:w="45" w:type="dxa"/>
+              <w:left w:w="0" w:type="dxa"/>
+              <w:bottom w:w="45" w:type="dxa"/>
+              <w:right w:w="0" w:type="dxa"/>
+            </w:tcMar>
+          </w:tcPr>
+          <w:p>
+            <w:pPr>
+              <w:rPr>
+                <w:i/>
+                <w:iCs/>
+              </w:rPr>
+            </w:pPr>
           </w:p>
         </w:tc>
         <w:tc>
@@ -295,28 +307,46 @@
               <w:bottom w:val="single" w:sz="6" w:space="0" w:color="909090"/>
               <w:right w:val="single" w:sz="6" w:space="0" w:color="909090"/>
             </w:tcBorders>
-            <w:tcMar>
-              <w:top w:w="45" w:type="dxa"/>
-              <w:left w:w="0" w:type="dxa"/>
-              <w:bottom w:w="45" w:type="dxa"/>
-              <w:right w:w="0" w:type="dxa"/>
-            </w:tcMar>
-            <w:hideMark/>
-          </w:tcPr>
-          <w:p>
-            <w:pPr>
-              <w:rPr>
-                <w:i/>
-                <w:iCs/>
-              </w:rPr>
-            </w:pPr>
-            <w:r>
-              <w:rPr>
-                <w:i/>
-                <w:iCs/>
-              </w:rPr>
-              <w:t>Newswire (Reuters Corpus Volume 1) </w:t>
-            </w:r>
+          </w:tcPr>
+          <w:p>
+            <w:pPr>
+              <w:rPr>
+                <w:i/>
+                <w:iCs/>
+              </w:rPr>
+            </w:pPr>
+            <w:r>
+              <w:rPr>
+                <w:sz w:val="17"/>
+                <w:szCs w:val="17"/>
+              </w:rPr>
+              <w:t>Newswire (Reuters multilingual, 5 languages)</w:t>
+            </w:r>
+          </w:p>
+        </w:tc>
+        <w:tc>
+          <w:tcPr>
+            <w:tcW w:w="0" w:type="auto"/>
+            <w:tcBorders>
+              <w:top w:val="single" w:sz="6" w:space="0" w:color="909090"/>
+              <w:left w:val="single" w:sz="6" w:space="0" w:color="909090"/>
+              <w:bottom w:val="single" w:sz="6" w:space="0" w:color="909090"/>
+              <w:right w:val="single" w:sz="6" w:space="0" w:color="909090"/>
+            </w:tcBorders>
+            <w:tcMar>
+              <w:top w:w="45" w:type="dxa"/>
+              <w:left w:w="0" w:type="dxa"/>
+              <w:bottom w:w="45" w:type="dxa"/>
+              <w:right w:w="0" w:type="dxa"/>
+            </w:tcMar>
+          </w:tcPr>
+          <w:p>
+            <w:pPr>
+              <w:rPr>
+                <w:i/>
+                <w:iCs/>
+              </w:rPr>
+            </w:pPr>
           </w:p>
         </w:tc>
         <w:tc>
@@ -438,28 +468,62 @@
               <w:bottom w:val="single" w:sz="6" w:space="0" w:color="909090"/>
               <w:right w:val="single" w:sz="6" w:space="0" w:color="909090"/>
             </w:tcBorders>
-            <w:tcMar>
-              <w:top w:w="45" w:type="dxa"/>
-              <w:left w:w="0" w:type="dxa"/>
-              <w:bottom w:w="45" w:type="dxa"/>
-              <w:right w:w="0" w:type="dxa"/>
-            </w:tcMar>
-            <w:hideMark/>
-          </w:tcPr>
-          <w:p>
-            <w:pPr>
-              <w:rPr>
-                <w:i/>
-                <w:iCs/>
-              </w:rPr>
-            </w:pPr>
-            <w:r>
-              <w:rPr>
-                <w:i/>
-                <w:iCs/>
-              </w:rPr>
-              <w:t>804,414 </w:t>
-            </w:r>
+          </w:tcPr>
+          <w:p>
+            <w:pPr>
+              <w:rPr>
+                <w:i/>
+                <w:iCs/>
+              </w:rPr>
+            </w:pPr>
+            <w:r>
+              <w:rPr>
+                <w:sz w:val="17"/>
+                <w:szCs w:val="17"/>
+              </w:rPr>
+              <w:t xml:space="preserve">111,740 total (18,758 English; </w:t>
+            </w:r>
+            <w:proofErr w:type="gramStart"/>
+            <w:r>
+              <w:rPr>
+                <w:sz w:val="17"/>
+                <w:szCs w:val="17"/>
+              </w:rPr>
+              <w:t>also</w:t>
+            </w:r>
+            <w:proofErr w:type="gramEnd"/>
+            <w:r>
+              <w:rPr>
+                <w:sz w:val="17"/>
+                <w:szCs w:val="17"/>
+              </w:rPr>
+              <w:t xml:space="preserve"> FR, GR, IT, SP)</w:t>
+            </w:r>
+          </w:p>
+        </w:tc>
+        <w:tc>
+          <w:tcPr>
+            <w:tcW w:w="0" w:type="auto"/>
+            <w:tcBorders>
+              <w:top w:val="single" w:sz="6" w:space="0" w:color="909090"/>
+              <w:left w:val="single" w:sz="6" w:space="0" w:color="909090"/>
+              <w:bottom w:val="single" w:sz="6" w:space="0" w:color="909090"/>
+              <w:right w:val="single" w:sz="6" w:space="0" w:color="909090"/>
+            </w:tcBorders>
+            <w:tcMar>
+              <w:top w:w="45" w:type="dxa"/>
+              <w:left w:w="0" w:type="dxa"/>
+              <w:bottom w:w="45" w:type="dxa"/>
+              <w:right w:w="0" w:type="dxa"/>
+            </w:tcMar>
+          </w:tcPr>
+          <w:p>
+            <w:pPr>
+              <w:rPr>
+                <w:i/>
+                <w:iCs/>
+              </w:rPr>
+            </w:pPr>
           </w:p>
         </w:tc>
         <w:tc>
@@ -597,28 +661,46 @@
               <w:bottom w:val="single" w:sz="6" w:space="0" w:color="909090"/>
               <w:right w:val="single" w:sz="6" w:space="0" w:color="909090"/>
             </w:tcBorders>
-            <w:tcMar>
-              <w:top w:w="45" w:type="dxa"/>
-              <w:left w:w="0" w:type="dxa"/>
-              <w:bottom w:w="45" w:type="dxa"/>
-              <w:right w:w="0" w:type="dxa"/>
-            </w:tcMar>
-            <w:hideMark/>
-          </w:tcPr>
-          <w:p>
-            <w:pPr>
-              <w:rPr>
-                <w:i/>
-                <w:iCs/>
-              </w:rPr>
-            </w:pPr>
-            <w:r>
-              <w:rPr>
-                <w:i/>
-                <w:iCs/>
-              </w:rPr>
-              <w:t>~120–200 words (newswire articles) </w:t>
-            </w:r>
+          </w:tcPr>
+          <w:p>
+            <w:pPr>
+              <w:rPr>
+                <w:i/>
+                <w:iCs/>
+              </w:rPr>
+            </w:pPr>
+            <w:r>
+              <w:rPr>
+                <w:sz w:val="17"/>
+                <w:szCs w:val="17"/>
+              </w:rPr>
+              <w:t>Feature vectors only (no raw text); ~200–800 non-zero features per doc</w:t>
+            </w:r>
+          </w:p>
+        </w:tc>
+        <w:tc>
+          <w:tcPr>
+            <w:tcW w:w="0" w:type="auto"/>
+            <w:tcBorders>
+              <w:top w:val="single" w:sz="6" w:space="0" w:color="909090"/>
+              <w:left w:val="single" w:sz="6" w:space="0" w:color="909090"/>
+              <w:bottom w:val="single" w:sz="6" w:space="0" w:color="909090"/>
+              <w:right w:val="single" w:sz="6" w:space="0" w:color="909090"/>
+            </w:tcBorders>
+            <w:tcMar>
+              <w:top w:w="45" w:type="dxa"/>
+              <w:left w:w="0" w:type="dxa"/>
+              <w:bottom w:w="45" w:type="dxa"/>
+              <w:right w:w="0" w:type="dxa"/>
+            </w:tcMar>
+          </w:tcPr>
+          <w:p>
+            <w:pPr>
+              <w:rPr>
+                <w:i/>
+                <w:iCs/>
+              </w:rPr>
+            </w:pPr>
           </w:p>
         </w:tc>
         <w:tc>
@@ -740,28 +822,46 @@
               <w:bottom w:val="single" w:sz="6" w:space="0" w:color="909090"/>
               <w:right w:val="single" w:sz="6" w:space="0" w:color="909090"/>
             </w:tcBorders>
-            <w:tcMar>
-              <w:top w:w="45" w:type="dxa"/>
-              <w:left w:w="0" w:type="dxa"/>
-              <w:bottom w:w="45" w:type="dxa"/>
-              <w:right w:w="0" w:type="dxa"/>
-            </w:tcMar>
-            <w:hideMark/>
-          </w:tcPr>
-          <w:p>
-            <w:pPr>
-              <w:rPr>
-                <w:i/>
-                <w:iCs/>
-              </w:rPr>
-            </w:pPr>
-            <w:r>
-              <w:rPr>
-                <w:i/>
-                <w:iCs/>
-              </w:rPr>
-              <w:t>Yes </w:t>
-            </w:r>
+          </w:tcPr>
+          <w:p>
+            <w:pPr>
+              <w:rPr>
+                <w:i/>
+                <w:iCs/>
+              </w:rPr>
+            </w:pPr>
+            <w:r>
+              <w:rPr>
+                <w:sz w:val="17"/>
+                <w:szCs w:val="17"/>
+              </w:rPr>
+              <w:t>Yes</w:t>
+            </w:r>
+          </w:p>
+        </w:tc>
+        <w:tc>
+          <w:tcPr>
+            <w:tcW w:w="0" w:type="auto"/>
+            <w:tcBorders>
+              <w:top w:val="single" w:sz="6" w:space="0" w:color="909090"/>
+              <w:left w:val="single" w:sz="6" w:space="0" w:color="909090"/>
+              <w:bottom w:val="single" w:sz="6" w:space="0" w:color="909090"/>
+              <w:right w:val="single" w:sz="6" w:space="0" w:color="909090"/>
+            </w:tcBorders>
+            <w:tcMar>
+              <w:top w:w="45" w:type="dxa"/>
+              <w:left w:w="0" w:type="dxa"/>
+              <w:bottom w:w="45" w:type="dxa"/>
+              <w:right w:w="0" w:type="dxa"/>
+            </w:tcMar>
+          </w:tcPr>
+          <w:p>
+            <w:pPr>
+              <w:rPr>
+                <w:i/>
+                <w:iCs/>
+              </w:rPr>
+            </w:pPr>
           </w:p>
         </w:tc>
         <w:tc>
@@ -883,28 +983,46 @@
               <w:bottom w:val="single" w:sz="6" w:space="0" w:color="909090"/>
               <w:right w:val="single" w:sz="6" w:space="0" w:color="909090"/>
             </w:tcBorders>
-            <w:tcMar>
-              <w:top w:w="45" w:type="dxa"/>
-              <w:left w:w="0" w:type="dxa"/>
-              <w:bottom w:w="45" w:type="dxa"/>
-              <w:right w:w="0" w:type="dxa"/>
-            </w:tcMar>
-            <w:hideMark/>
-          </w:tcPr>
-          <w:p>
-            <w:pPr>
-              <w:rPr>
-                <w:i/>
-                <w:iCs/>
-              </w:rPr>
-            </w:pPr>
-            <w:r>
-              <w:rPr>
-                <w:i/>
-                <w:iCs/>
-              </w:rPr>
-              <w:t>Fine (103 categories) </w:t>
-            </w:r>
+          </w:tcPr>
+          <w:p>
+            <w:pPr>
+              <w:rPr>
+                <w:i/>
+                <w:iCs/>
+              </w:rPr>
+            </w:pPr>
+            <w:r>
+              <w:rPr>
+                <w:sz w:val="17"/>
+                <w:szCs w:val="17"/>
+              </w:rPr>
+              <w:t>Coarse (6 categories: C15, CCAT, E21, ECAT, GCAT, M11)</w:t>
+            </w:r>
+          </w:p>
+        </w:tc>
+        <w:tc>
+          <w:tcPr>
+            <w:tcW w:w="0" w:type="auto"/>
+            <w:tcBorders>
+              <w:top w:val="single" w:sz="6" w:space="0" w:color="909090"/>
+              <w:left w:val="single" w:sz="6" w:space="0" w:color="909090"/>
+              <w:bottom w:val="single" w:sz="6" w:space="0" w:color="909090"/>
+              <w:right w:val="single" w:sz="6" w:space="0" w:color="909090"/>
+            </w:tcBorders>
+            <w:tcMar>
+              <w:top w:w="45" w:type="dxa"/>
+              <w:left w:w="0" w:type="dxa"/>
+              <w:bottom w:w="45" w:type="dxa"/>
+              <w:right w:w="0" w:type="dxa"/>
+            </w:tcMar>
+          </w:tcPr>
+          <w:p>
+            <w:pPr>
+              <w:rPr>
+                <w:i/>
+                <w:iCs/>
+              </w:rPr>
+            </w:pPr>
           </w:p>
         </w:tc>
         <w:tc>
@@ -1026,28 +1144,46 @@
               <w:bottom w:val="single" w:sz="6" w:space="0" w:color="909090"/>
               <w:right w:val="single" w:sz="6" w:space="0" w:color="909090"/>
             </w:tcBorders>
-            <w:tcMar>
-              <w:top w:w="45" w:type="dxa"/>
-              <w:left w:w="0" w:type="dxa"/>
-              <w:bottom w:w="45" w:type="dxa"/>
-              <w:right w:w="0" w:type="dxa"/>
-            </w:tcMar>
-            <w:hideMark/>
-          </w:tcPr>
-          <w:p>
-            <w:pPr>
-              <w:rPr>
-                <w:i/>
-                <w:iCs/>
-              </w:rPr>
-            </w:pPr>
-            <w:r>
-              <w:rPr>
-                <w:i/>
-                <w:iCs/>
-              </w:rPr>
-              <w:t>Hierarchical (4-level topic tree) </w:t>
-            </w:r>
+          </w:tcPr>
+          <w:p>
+            <w:pPr>
+              <w:rPr>
+                <w:i/>
+                <w:iCs/>
+              </w:rPr>
+            </w:pPr>
+            <w:r>
+              <w:rPr>
+                <w:sz w:val="17"/>
+                <w:szCs w:val="17"/>
+              </w:rPr>
+              <w:t>Flat</w:t>
+            </w:r>
+          </w:p>
+        </w:tc>
+        <w:tc>
+          <w:tcPr>
+            <w:tcW w:w="0" w:type="auto"/>
+            <w:tcBorders>
+              <w:top w:val="single" w:sz="6" w:space="0" w:color="909090"/>
+              <w:left w:val="single" w:sz="6" w:space="0" w:color="909090"/>
+              <w:bottom w:val="single" w:sz="6" w:space="0" w:color="909090"/>
+              <w:right w:val="single" w:sz="6" w:space="0" w:color="909090"/>
+            </w:tcBorders>
+            <w:tcMar>
+              <w:top w:w="45" w:type="dxa"/>
+              <w:left w:w="0" w:type="dxa"/>
+              <w:bottom w:w="45" w:type="dxa"/>
+              <w:right w:w="0" w:type="dxa"/>
+            </w:tcMar>
+          </w:tcPr>
+          <w:p>
+            <w:pPr>
+              <w:rPr>
+                <w:i/>
+                <w:iCs/>
+              </w:rPr>
+            </w:pPr>
           </w:p>
         </w:tc>
         <w:tc>
@@ -1189,44 +1325,55 @@
               <w:bottom w:val="single" w:sz="6" w:space="0" w:color="909090"/>
               <w:right w:val="single" w:sz="6" w:space="0" w:color="909090"/>
             </w:tcBorders>
-            <w:tcMar>
-              <w:top w:w="45" w:type="dxa"/>
-              <w:left w:w="0" w:type="dxa"/>
-              <w:bottom w:w="45" w:type="dxa"/>
-              <w:right w:w="0" w:type="dxa"/>
-            </w:tcMar>
-            <w:hideMark/>
-          </w:tcPr>
-          <w:p>
-            <w:pPr>
-              <w:rPr>
-                <w:i/>
-                <w:iCs/>
-              </w:rPr>
-            </w:pPr>
-            <w:r>
-              <w:rPr>
-                <w:i/>
-                <w:iCs/>
-              </w:rPr>
-              <w:t>Multi-label (</w:t>
-            </w:r>
-            <w:proofErr w:type="spellStart"/>
-            <w:r>
-              <w:rPr>
-                <w:i/>
-                <w:iCs/>
-              </w:rPr>
-              <w:t>avg</w:t>
-            </w:r>
-            <w:proofErr w:type="spellEnd"/>
-            <w:r>
-              <w:rPr>
-                <w:i/>
-                <w:iCs/>
-              </w:rPr>
-              <w:t> ~3.2 labels/doc) </w:t>
-            </w:r>
+          </w:tcPr>
+          <w:p>
+            <w:pPr>
+              <w:rPr>
+                <w:i/>
+                <w:iCs/>
+              </w:rPr>
+            </w:pPr>
+            <w:proofErr w:type="gramStart"/>
+            <w:r>
+              <w:rPr>
+                <w:sz w:val="17"/>
+                <w:szCs w:val="17"/>
+              </w:rPr>
+              <w:t>Single-label</w:t>
+            </w:r>
+            <w:proofErr w:type="gramEnd"/>
+            <w:r>
+              <w:rPr>
+                <w:sz w:val="17"/>
+                <w:szCs w:val="17"/>
+              </w:rPr>
+              <w:t xml:space="preserve"> (documents assigned to smallest class if multi-class)</w:t>
+            </w:r>
+          </w:p>
+        </w:tc>
+        <w:tc>
+          <w:tcPr>
+            <w:tcW w:w="0" w:type="auto"/>
+            <w:tcBorders>
+              <w:top w:val="single" w:sz="6" w:space="0" w:color="909090"/>
+              <w:left w:val="single" w:sz="6" w:space="0" w:color="909090"/>
+              <w:bottom w:val="single" w:sz="6" w:space="0" w:color="909090"/>
+              <w:right w:val="single" w:sz="6" w:space="0" w:color="909090"/>
+            </w:tcBorders>
+            <w:tcMar>
+              <w:top w:w="45" w:type="dxa"/>
+              <w:left w:w="0" w:type="dxa"/>
+              <w:bottom w:w="45" w:type="dxa"/>
+              <w:right w:w="0" w:type="dxa"/>
+            </w:tcMar>
+          </w:tcPr>
+          <w:p>
+            <w:pPr>
+              <w:rPr>
+                <w:i/>
+                <w:iCs/>
+              </w:rPr>
+            </w:pPr>
           </w:p>
         </w:tc>
         <w:tc>
@@ -1348,28 +1495,46 @@
               <w:bottom w:val="single" w:sz="6" w:space="0" w:color="909090"/>
               <w:right w:val="single" w:sz="6" w:space="0" w:color="909090"/>
             </w:tcBorders>
-            <w:tcMar>
-              <w:top w:w="45" w:type="dxa"/>
-              <w:left w:w="0" w:type="dxa"/>
-              <w:bottom w:w="45" w:type="dxa"/>
-              <w:right w:w="0" w:type="dxa"/>
-            </w:tcMar>
-            <w:hideMark/>
-          </w:tcPr>
-          <w:p>
-            <w:pPr>
-              <w:rPr>
-                <w:i/>
-                <w:iCs/>
-              </w:rPr>
-            </w:pPr>
-            <w:r>
-              <w:rPr>
-                <w:i/>
-                <w:iCs/>
-              </w:rPr>
-              <w:t>Good – large scale, multi-label, well-documented </w:t>
-            </w:r>
+          </w:tcPr>
+          <w:p>
+            <w:pPr>
+              <w:rPr>
+                <w:i/>
+                <w:iCs/>
+              </w:rPr>
+            </w:pPr>
+            <w:r>
+              <w:rPr>
+                <w:sz w:val="17"/>
+                <w:szCs w:val="17"/>
+              </w:rPr>
+              <w:t>Moderate – only 6 categories; useful for cross-lingual topic analysis</w:t>
+            </w:r>
+          </w:p>
+        </w:tc>
+        <w:tc>
+          <w:tcPr>
+            <w:tcW w:w="0" w:type="auto"/>
+            <w:tcBorders>
+              <w:top w:val="single" w:sz="6" w:space="0" w:color="909090"/>
+              <w:left w:val="single" w:sz="6" w:space="0" w:color="909090"/>
+              <w:bottom w:val="single" w:sz="6" w:space="0" w:color="909090"/>
+              <w:right w:val="single" w:sz="6" w:space="0" w:color="909090"/>
+            </w:tcBorders>
+            <w:tcMar>
+              <w:top w:w="45" w:type="dxa"/>
+              <w:left w:w="0" w:type="dxa"/>
+              <w:bottom w:w="45" w:type="dxa"/>
+              <w:right w:w="0" w:type="dxa"/>
+            </w:tcMar>
+          </w:tcPr>
+          <w:p>
+            <w:pPr>
+              <w:rPr>
+                <w:i/>
+                <w:iCs/>
+              </w:rPr>
+            </w:pPr>
           </w:p>
         </w:tc>
         <w:tc>
@@ -1491,28 +1656,46 @@
               <w:bottom w:val="single" w:sz="6" w:space="0" w:color="909090"/>
               <w:right w:val="single" w:sz="6" w:space="0" w:color="909090"/>
             </w:tcBorders>
-            <w:tcMar>
-              <w:top w:w="45" w:type="dxa"/>
-              <w:left w:w="0" w:type="dxa"/>
-              <w:bottom w:w="45" w:type="dxa"/>
-              <w:right w:w="0" w:type="dxa"/>
-            </w:tcMar>
-            <w:hideMark/>
-          </w:tcPr>
-          <w:p>
-            <w:pPr>
-              <w:rPr>
-                <w:i/>
-                <w:iCs/>
-              </w:rPr>
-            </w:pPr>
-            <w:r>
-              <w:rPr>
-                <w:i/>
-                <w:iCs/>
-              </w:rPr>
-              <w:t>Poor – documents are short newswire texts </w:t>
-            </w:r>
+          </w:tcPr>
+          <w:p>
+            <w:pPr>
+              <w:rPr>
+                <w:i/>
+                <w:iCs/>
+              </w:rPr>
+            </w:pPr>
+            <w:r>
+              <w:rPr>
+                <w:sz w:val="17"/>
+                <w:szCs w:val="17"/>
+              </w:rPr>
+              <w:t>Poor – feature vectors only, no raw text for sentence-level methods</w:t>
+            </w:r>
+          </w:p>
+        </w:tc>
+        <w:tc>
+          <w:tcPr>
+            <w:tcW w:w="0" w:type="auto"/>
+            <w:tcBorders>
+              <w:top w:val="single" w:sz="6" w:space="0" w:color="909090"/>
+              <w:left w:val="single" w:sz="6" w:space="0" w:color="909090"/>
+              <w:bottom w:val="single" w:sz="6" w:space="0" w:color="909090"/>
+              <w:right w:val="single" w:sz="6" w:space="0" w:color="909090"/>
+            </w:tcBorders>
+            <w:tcMar>
+              <w:top w:w="45" w:type="dxa"/>
+              <w:left w:w="0" w:type="dxa"/>
+              <w:bottom w:w="45" w:type="dxa"/>
+              <w:right w:w="0" w:type="dxa"/>
+            </w:tcMar>
+          </w:tcPr>
+          <w:p>
+            <w:pPr>
+              <w:rPr>
+                <w:i/>
+                <w:iCs/>
+              </w:rPr>
+            </w:pPr>
           </w:p>
         </w:tc>
         <w:tc>
@@ -1634,44 +1817,55 @@
               <w:bottom w:val="single" w:sz="6" w:space="0" w:color="909090"/>
               <w:right w:val="single" w:sz="6" w:space="0" w:color="909090"/>
             </w:tcBorders>
-            <w:tcMar>
-              <w:top w:w="45" w:type="dxa"/>
-              <w:left w:w="0" w:type="dxa"/>
-              <w:bottom w:w="45" w:type="dxa"/>
-              <w:right w:w="0" w:type="dxa"/>
-            </w:tcMar>
-            <w:hideMark/>
-          </w:tcPr>
-          <w:p>
-            <w:pPr>
-              <w:rPr>
-                <w:i/>
-                <w:iCs/>
-              </w:rPr>
-            </w:pPr>
-            <w:r>
-              <w:rPr>
-                <w:i/>
-                <w:iCs/>
-              </w:rPr>
-              <w:t>Raw text requires licensed NIST distribution; </w:t>
-            </w:r>
+          </w:tcPr>
+          <w:p>
+            <w:pPr>
+              <w:rPr>
+                <w:i/>
+                <w:iCs/>
+              </w:rPr>
+            </w:pPr>
             <w:proofErr w:type="spellStart"/>
             <w:r>
               <w:rPr>
-                <w:i/>
-                <w:iCs/>
-              </w:rPr>
-              <w:t>sklearn</w:t>
+                <w:sz w:val="17"/>
+                <w:szCs w:val="17"/>
+              </w:rPr>
+              <w:t>SVMlight</w:t>
             </w:r>
             <w:proofErr w:type="spellEnd"/>
             <w:r>
               <w:rPr>
-                <w:i/>
-                <w:iCs/>
-              </w:rPr>
-              <w:t> only provides TF-IDF features; tokenisation already applied </w:t>
-            </w:r>
+                <w:sz w:val="17"/>
+                <w:szCs w:val="17"/>
+              </w:rPr>
+              <w:t xml:space="preserve"> format requires parsing; no raw text available; multilingual so must filter by language; feature indices not mapped to words</w:t>
+            </w:r>
+          </w:p>
+        </w:tc>
+        <w:tc>
+          <w:tcPr>
+            <w:tcW w:w="0" w:type="auto"/>
+            <w:tcBorders>
+              <w:top w:val="single" w:sz="6" w:space="0" w:color="909090"/>
+              <w:left w:val="single" w:sz="6" w:space="0" w:color="909090"/>
+              <w:bottom w:val="single" w:sz="6" w:space="0" w:color="909090"/>
+              <w:right w:val="single" w:sz="6" w:space="0" w:color="909090"/>
+            </w:tcBorders>
+            <w:tcMar>
+              <w:top w:w="45" w:type="dxa"/>
+              <w:left w:w="0" w:type="dxa"/>
+              <w:bottom w:w="45" w:type="dxa"/>
+              <w:right w:w="0" w:type="dxa"/>
+            </w:tcMar>
+          </w:tcPr>
+          <w:p>
+            <w:pPr>
+              <w:rPr>
+                <w:i/>
+                <w:iCs/>
+              </w:rPr>
+            </w:pPr>
           </w:p>
         </w:tc>
         <w:tc>
@@ -1809,44 +2003,46 @@
               <w:bottom w:val="single" w:sz="6" w:space="0" w:color="909090"/>
               <w:right w:val="single" w:sz="6" w:space="0" w:color="909090"/>
             </w:tcBorders>
-            <w:tcMar>
-              <w:top w:w="45" w:type="dxa"/>
-              <w:left w:w="0" w:type="dxa"/>
-              <w:bottom w:w="45" w:type="dxa"/>
-              <w:right w:w="0" w:type="dxa"/>
-            </w:tcMar>
-            <w:hideMark/>
-          </w:tcPr>
-          <w:p>
-            <w:pPr>
-              <w:rPr>
-                <w:i/>
-                <w:iCs/>
-              </w:rPr>
-            </w:pPr>
-            <w:r>
-              <w:rPr>
-                <w:i/>
-                <w:iCs/>
-              </w:rPr>
-              <w:t>Restricted – requires NIST licence for raw text; TF-IDF available via </w:t>
-            </w:r>
-            <w:proofErr w:type="spellStart"/>
-            <w:r>
-              <w:rPr>
-                <w:i/>
-                <w:iCs/>
-              </w:rPr>
-              <w:t>sklearn</w:t>
-            </w:r>
-            <w:proofErr w:type="spellEnd"/>
-            <w:r>
-              <w:rPr>
-                <w:i/>
-                <w:iCs/>
-              </w:rPr>
-              <w:t> </w:t>
-            </w:r>
+          </w:tcPr>
+          <w:p>
+            <w:pPr>
+              <w:rPr>
+                <w:i/>
+                <w:iCs/>
+              </w:rPr>
+            </w:pPr>
+            <w:r>
+              <w:rPr>
+                <w:sz w:val="17"/>
+                <w:szCs w:val="17"/>
+              </w:rPr>
+              <w:t>CC BY 4.0 – freely available from UCI ML Repository</w:t>
+            </w:r>
+          </w:p>
+        </w:tc>
+        <w:tc>
+          <w:tcPr>
+            <w:tcW w:w="0" w:type="auto"/>
+            <w:tcBorders>
+              <w:top w:val="single" w:sz="6" w:space="0" w:color="909090"/>
+              <w:left w:val="single" w:sz="6" w:space="0" w:color="909090"/>
+              <w:bottom w:val="single" w:sz="6" w:space="0" w:color="909090"/>
+              <w:right w:val="single" w:sz="6" w:space="0" w:color="909090"/>
+            </w:tcBorders>
+            <w:tcMar>
+              <w:top w:w="45" w:type="dxa"/>
+              <w:left w:w="0" w:type="dxa"/>
+              <w:bottom w:w="45" w:type="dxa"/>
+              <w:right w:w="0" w:type="dxa"/>
+            </w:tcMar>
+          </w:tcPr>
+          <w:p>
+            <w:pPr>
+              <w:rPr>
+                <w:i/>
+                <w:iCs/>
+              </w:rPr>
+            </w:pPr>
           </w:p>
         </w:tc>
         <w:tc>
@@ -2016,28 +2212,46 @@
               <w:bottom w:val="single" w:sz="6" w:space="0" w:color="909090"/>
               <w:right w:val="single" w:sz="6" w:space="0" w:color="909090"/>
             </w:tcBorders>
-            <w:tcMar>
-              <w:top w:w="45" w:type="dxa"/>
-              <w:left w:w="0" w:type="dxa"/>
-              <w:bottom w:w="45" w:type="dxa"/>
-              <w:right w:w="0" w:type="dxa"/>
-            </w:tcMar>
-            <w:hideMark/>
-          </w:tcPr>
-          <w:p>
-            <w:pPr>
-              <w:rPr>
-                <w:i/>
-                <w:iCs/>
-              </w:rPr>
-            </w:pPr>
-            <w:r>
-              <w:rPr>
-                <w:i/>
-                <w:iCs/>
-              </w:rPr>
-              <w:t>Lewis, D. et al. (2004). RCV1: A new benchmark collection for text categorization research. JMLR, 5, 361–397. </w:t>
-            </w:r>
+          </w:tcPr>
+          <w:p>
+            <w:pPr>
+              <w:rPr>
+                <w:i/>
+                <w:iCs/>
+              </w:rPr>
+            </w:pPr>
+            <w:r>
+              <w:rPr>
+                <w:sz w:val="17"/>
+                <w:szCs w:val="17"/>
+              </w:rPr>
+              <w:t>Amini, M. &amp; Goutte, C. (2009). A study on dimensionality reduction for text categorization. UCI ML Repository. https://doi.org/10.24432/C5FS5R</w:t>
+            </w:r>
+          </w:p>
+        </w:tc>
+        <w:tc>
+          <w:tcPr>
+            <w:tcW w:w="0" w:type="auto"/>
+            <w:tcBorders>
+              <w:top w:val="single" w:sz="6" w:space="0" w:color="909090"/>
+              <w:left w:val="single" w:sz="6" w:space="0" w:color="909090"/>
+              <w:bottom w:val="single" w:sz="6" w:space="0" w:color="909090"/>
+              <w:right w:val="single" w:sz="6" w:space="0" w:color="909090"/>
+            </w:tcBorders>
+            <w:tcMar>
+              <w:top w:w="45" w:type="dxa"/>
+              <w:left w:w="0" w:type="dxa"/>
+              <w:bottom w:w="45" w:type="dxa"/>
+              <w:right w:w="0" w:type="dxa"/>
+            </w:tcMar>
+          </w:tcPr>
+          <w:p>
+            <w:pPr>
+              <w:rPr>
+                <w:i/>
+                <w:iCs/>
+              </w:rPr>
+            </w:pPr>
           </w:p>
         </w:tc>
         <w:tc>
@@ -2155,15 +2369,15 @@
         <w:spacing w:after="160"/>
       </w:pPr>
       <w:r>
-        <w:t xml:space="preserve">RCV1-v2 is the strongest candidate for large-scale multi-label evaluation. With over 800,000 documents and a hierarchical 103-category taxonomy, it tests whether topic extraction methods can recover fine-grained and overlapping themes. However, raw text access requires a NIST licence; the </w:t>
+        <w:t xml:space="preserve">RCV1/RCV2 (UCI) is a multilingual newswire collection with 111,740 documents across five languages (English, French, German, Italian, Spanish) and six categories. The English subset contains 18,758 documents. The dataset is freely available under CC BY 4.0 from the UCI ML Repository. The main limitation is that it provides feature vectors in </w:t>
       </w:r>
       <w:proofErr w:type="spellStart"/>
       <w:r>
-        <w:t>sklearn</w:t>
+        <w:t>SVMlight</w:t>
       </w:r>
       <w:proofErr w:type="spellEnd"/>
       <w:r>
-        <w:t xml:space="preserve"> distribution provides only pre-computed TF-IDF features, which limits sentence-level and embedding-based analysis. If the licence can be obtained, RCV1-v2 should be included as a scaling benchmark; otherwise, the TF-IDF features still allow label distribution and clustering experiments.</w:t>
+        <w:t xml:space="preserve"> format rather than raw text, so sentence-level and embedding-based analysis is not possible without the original Reuters text. The six categories are also quite coarse, which limits its value for fine-grained topic modelling. It is best suited as a secondary benchmark for verifying that clustering methods work across a moderate number of broad categories.</w:t>
       </w:r>
     </w:p>
     <w:p>
@@ -2200,7 +2414,7 @@
       </w:r>
       <w:proofErr w:type="spellEnd"/>
       <w:r>
-        <w:t xml:space="preserve"> for curriculum-relevant topic extraction once slide text is available, and (3) RCV1-v2 for large-scale multi-label evaluation if the NIST licence is secured.</w:t>
+        <w:t xml:space="preserve"> for curriculum-relevant topic extraction once slide text is available, and (3) RCV1/RCV2 (UCI) as a secondary benchmark for broad-category classification with freely available feature vectors.</w:t>
       </w:r>
     </w:p>
     <w:p/>

</xml_diff>